<commit_message>
Update resume: add flagship healthcare and voice AI projects, correct experience years
</commit_message>
<xml_diff>
--- a/Reymarc_Almaden_Resume_Portfolio.docx
+++ b/Reymarc_Almaden_Resume_Portfolio.docx
@@ -50,6 +50,20 @@
     </w:p>
     <w:p>
       <w:pPr>
+        <w:spacing w:after="100"/>
+        <w:jc w:val="center"/>
+      </w:pPr>
+      <w:r>
+        <w:rPr>
+          <w:color w:val="2563EB"/>
+          <w:sz w:val="18"/>
+          <w:szCs w:val="18"/>
+        </w:rPr>
+        <w:t xml:space="preserve">reymarc-portfolio.vercel.app | linkedin.com/in/rey-automations | github.com/ralmaden-ai</w:t>
+      </w:r>
+    </w:p>
+    <w:p>
+      <w:pPr>
         <w:pBdr>
           <w:bottom w:val="single" w:color="2563EB" w:sz="6" w:space="2"/>
         </w:pBdr>
@@ -76,7 +90,7 @@
           <w:sz w:val="20"/>
           <w:szCs w:val="20"/>
         </w:rPr>
-        <w:t xml:space="preserve">Detail-oriented professional with 2+ years of experience in healthcare records retrieval and high-volume customer operations, now building a parallel track in AI automation. Skilled in HIPAA-compliant medical records retrieval, provider/facility verification, and CRM/case management systems, alongside hands-on experience designing end-to-end automation workflows using n8n, Make, Zapier, and GoHighLevel — including AI-powered lead tracking, CRM/opportunity pipelines, appointment reminder systems, and RAG-based documentation tools. Strong written and verbal communicator with a proven ability to manage high-volume caseloads independently while identifying process inefficiencies and building systems to solve them.</w:t>
+        <w:t xml:space="preserve">Detail-oriented professional with 4+ years of experience across healthcare records retrieval and high-volume customer operations, now building a parallel track in AI automation. Skilled in HIPAA-compliant medical records retrieval, provider/facility verification, and CRM/case management systems, alongside hands-on experience designing end-to-end automation workflows using n8n, Make, Zapier, and GoHighLevel — including AI-powered lead tracking, CRM/opportunity pipelines, appointment reminder systems, and RAG-based documentation tools. Strong written and verbal communicator with a proven ability to manage high-volume caseloads independently while identifying process inefficiencies and building systems to solve them.</w:t>
       </w:r>
     </w:p>
     <w:p>
@@ -510,7 +524,7 @@
           <w:sz w:val="21"/>
           <w:szCs w:val="21"/>
         </w:rPr>
-        <w:t xml:space="preserve">Business Group Automation Hub — 5-Module Portfolio Project</w:t>
+        <w:t xml:space="preserve">Medical Records Retrieval Automation System — 7-Workflow Portfolio Project</w:t>
       </w:r>
     </w:p>
     <w:p>
@@ -535,104 +549,75 @@
           <w:sz w:val="19"/>
           <w:szCs w:val="19"/>
         </w:rPr>
-        <w:t xml:space="preserve">n8n, Groq AI, Google Sheets, Gmail, Serper.dev</w:t>
-      </w:r>
-    </w:p>
-    <w:p>
-      <w:pPr>
-        <w:spacing w:after="40"/>
-      </w:pPr>
-      <w:r>
-        <w:rPr>
-          <w:sz w:val="20"/>
-          <w:szCs w:val="20"/>
-        </w:rPr>
-        <w:t xml:space="preserve">Built for a multi-industry Australian business group, covering five distinct operational functions in a single automation ecosystem:</w:t>
-      </w:r>
-    </w:p>
-    <w:p>
-      <w:pPr>
-        <w:pStyle w:val="ListParagraph"/>
-        <w:numPr>
-          <w:ilvl w:val="0"/>
-          <w:numId w:val="1"/>
-        </w:numPr>
-        <w:spacing w:after="60"/>
-      </w:pPr>
-      <w:r>
-        <w:rPr>
-          <w:sz w:val="20"/>
-          <w:szCs w:val="20"/>
-        </w:rPr>
-        <w:t xml:space="preserve">Weekly Operations Report — automated data aggregation and summary distribution.</w:t>
-      </w:r>
-    </w:p>
-    <w:p>
-      <w:pPr>
-        <w:pStyle w:val="ListParagraph"/>
-        <w:numPr>
-          <w:ilvl w:val="0"/>
-          <w:numId w:val="1"/>
-        </w:numPr>
-        <w:spacing w:after="60"/>
-      </w:pPr>
-      <w:r>
-        <w:rPr>
-          <w:sz w:val="20"/>
-          <w:szCs w:val="20"/>
-        </w:rPr>
-        <w:t xml:space="preserve">AI Lead Tracker — AI-assisted lead capture, scoring, and CRM logging.</w:t>
-      </w:r>
-    </w:p>
-    <w:p>
-      <w:pPr>
-        <w:pStyle w:val="ListParagraph"/>
-        <w:numPr>
-          <w:ilvl w:val="0"/>
-          <w:numId w:val="1"/>
-        </w:numPr>
-        <w:spacing w:after="60"/>
-      </w:pPr>
-      <w:r>
-        <w:rPr>
-          <w:sz w:val="20"/>
-          <w:szCs w:val="20"/>
-        </w:rPr>
-        <w:t xml:space="preserve">Invoice Follow-up Automation — automated payment reminder sequences.</w:t>
-      </w:r>
-    </w:p>
-    <w:p>
-      <w:pPr>
-        <w:pStyle w:val="ListParagraph"/>
-        <w:numPr>
-          <w:ilvl w:val="0"/>
-          <w:numId w:val="1"/>
-        </w:numPr>
-        <w:spacing w:after="60"/>
-      </w:pPr>
-      <w:r>
-        <w:rPr>
-          <w:sz w:val="20"/>
-          <w:szCs w:val="20"/>
-        </w:rPr>
-        <w:t xml:space="preserve">Property Project Tracker — status tracking across active property projects.</w:t>
-      </w:r>
-    </w:p>
-    <w:p>
-      <w:pPr>
-        <w:pStyle w:val="ListParagraph"/>
-        <w:numPr>
-          <w:ilvl w:val="0"/>
-          <w:numId w:val="1"/>
-        </w:numPr>
-        <w:spacing w:after="60"/>
-      </w:pPr>
-      <w:r>
-        <w:rPr>
-          <w:sz w:val="20"/>
-          <w:szCs w:val="20"/>
-        </w:rPr>
-        <w:t xml:space="preserve">Research Summarizer — AI-generated research digests using Serper.dev search + Groq summarization.</w:t>
+        <w:t xml:space="preserve">n8n, Groq AI (Llama 3.1), Airtable, Webhooks, REST APIs</w:t>
+      </w:r>
+    </w:p>
+    <w:p>
+      <w:pPr>
+        <w:pStyle w:val="ListParagraph"/>
+        <w:numPr>
+          <w:ilvl w:val="0"/>
+          <w:numId w:val="1"/>
+        </w:numPr>
+        <w:spacing w:after="60"/>
+      </w:pPr>
+      <w:r>
+        <w:rPr>
+          <w:sz w:val="20"/>
+          <w:szCs w:val="20"/>
+        </w:rPr>
+        <w:t xml:space="preserve">Built a seven-workflow system covering the full chart-retrieval lifecycle — intake, provider verification, request generation, transmission, follow-up, response classification, and completion — informed directly by chart retrieval work at Cotiviti.</w:t>
+      </w:r>
+    </w:p>
+    <w:p>
+      <w:pPr>
+        <w:pStyle w:val="ListParagraph"/>
+        <w:numPr>
+          <w:ilvl w:val="0"/>
+          <w:numId w:val="1"/>
+        </w:numPr>
+        <w:spacing w:after="60"/>
+      </w:pPr>
+      <w:r>
+        <w:rPr>
+          <w:sz w:val="20"/>
+          <w:szCs w:val="20"/>
+        </w:rPr>
+        <w:t xml:space="preserve">Coordinated workflows through shared Airtable state rather than direct calls, so any stage can be re-run independently and stalled cases stay visible as records.</w:t>
+      </w:r>
+    </w:p>
+    <w:p>
+      <w:pPr>
+        <w:pStyle w:val="ListParagraph"/>
+        <w:numPr>
+          <w:ilvl w:val="0"/>
+          <w:numId w:val="1"/>
+        </w:numPr>
+        <w:spacing w:after="60"/>
+      </w:pPr>
+      <w:r>
+        <w:rPr>
+          <w:sz w:val="20"/>
+          <w:szCs w:val="20"/>
+        </w:rPr>
+        <w:t xml:space="preserve">Scoped AI to judgment-support only — match scoring and five-way reply classification — with a human approval gate at every real decision point.</w:t>
+      </w:r>
+    </w:p>
+    <w:p>
+      <w:pPr>
+        <w:pStyle w:val="ListParagraph"/>
+        <w:numPr>
+          <w:ilvl w:val="0"/>
+          <w:numId w:val="1"/>
+        </w:numPr>
+        <w:spacing w:after="60"/>
+      </w:pPr>
+      <w:r>
+        <w:rPr>
+          <w:sz w:val="20"/>
+          <w:szCs w:val="20"/>
+        </w:rPr>
+        <w:t xml:space="preserve">Maintained a full per-case audit trail; built and tested end to end on 100% synthetic patient data.</w:t>
       </w:r>
     </w:p>
     <w:p>
@@ -647,7 +632,7 @@
           <w:sz w:val="21"/>
           <w:szCs w:val="21"/>
         </w:rPr>
-        <w:t xml:space="preserve">Mini RAG Note Generator</w:t>
+        <w:t xml:space="preserve">Voice AI IVR Call Router — Clinic Front Desk (Portfolio Project)</w:t>
       </w:r>
     </w:p>
     <w:p>
@@ -672,41 +657,58 @@
           <w:sz w:val="19"/>
           <w:szCs w:val="19"/>
         </w:rPr>
-        <w:t xml:space="preserve">n8n, RAG architecture, GPT workflows, JSON knowledge assets</w:t>
-      </w:r>
-    </w:p>
-    <w:p>
-      <w:pPr>
-        <w:pStyle w:val="ListParagraph"/>
-        <w:numPr>
-          <w:ilvl w:val="0"/>
-          <w:numId w:val="1"/>
-        </w:numPr>
-        <w:spacing w:after="60"/>
-      </w:pPr>
-      <w:r>
-        <w:rPr>
-          <w:sz w:val="20"/>
-          <w:szCs w:val="20"/>
-        </w:rPr>
-        <w:t xml:space="preserve">Built to demonstrate applied AI documentation skills for a healthcare-tech AI Implementation Specialist role.</w:t>
-      </w:r>
-    </w:p>
-    <w:p>
-      <w:pPr>
-        <w:pStyle w:val="ListParagraph"/>
-        <w:numPr>
-          <w:ilvl w:val="0"/>
-          <w:numId w:val="1"/>
-        </w:numPr>
-        <w:spacing w:after="60"/>
-      </w:pPr>
-      <w:r>
-        <w:rPr>
-          <w:sz w:val="20"/>
-          <w:szCs w:val="20"/>
-        </w:rPr>
-        <w:t xml:space="preserve">Mapped clinical documentation needs (SOAP notes, structured records) to a retrieval-augmented generation pipeline, converting unstructured input into structured, retrievable knowledge assets.</w:t>
+        <w:t xml:space="preserve">n8n, VAPI, Airtable, Groq</w:t>
+      </w:r>
+    </w:p>
+    <w:p>
+      <w:pPr>
+        <w:pStyle w:val="ListParagraph"/>
+        <w:numPr>
+          <w:ilvl w:val="0"/>
+          <w:numId w:val="1"/>
+        </w:numPr>
+        <w:spacing w:after="60"/>
+      </w:pPr>
+      <w:r>
+        <w:rPr>
+          <w:sz w:val="20"/>
+          <w:szCs w:val="20"/>
+        </w:rPr>
+        <w:t xml:space="preserve">Built a voice AI receptionist that captures caller intent in natural language and routes across six departments, holding routing logic in n8n rather than the assistant prompt so business rules stay testable.</w:t>
+      </w:r>
+    </w:p>
+    <w:p>
+      <w:pPr>
+        <w:pStyle w:val="ListParagraph"/>
+        <w:numPr>
+          <w:ilvl w:val="0"/>
+          <w:numId w:val="1"/>
+        </w:numPr>
+        <w:spacing w:after="60"/>
+      </w:pPr>
+      <w:r>
+        <w:rPr>
+          <w:sz w:val="20"/>
+          <w:szCs w:val="20"/>
+        </w:rPr>
+        <w:t xml:space="preserve">Engineered the real-time path to answer the caller before any database write, keeping latency sub-second, with department-specific rules (nurse triage always reaches a human).</w:t>
+      </w:r>
+    </w:p>
+    <w:p>
+      <w:pPr>
+        <w:pStyle w:val="ListParagraph"/>
+        <w:numPr>
+          <w:ilvl w:val="0"/>
+          <w:numId w:val="1"/>
+        </w:numPr>
+        <w:spacing w:after="60"/>
+      </w:pPr>
+      <w:r>
+        <w:rPr>
+          <w:sz w:val="20"/>
+          <w:szCs w:val="20"/>
+        </w:rPr>
+        <w:t xml:space="preserve">Found and fixed two silent-failure classes in review: misprioritised unmatched records, and duplicate tickets from webhook retries.</w:t>
       </w:r>
     </w:p>
     <w:p>
@@ -721,7 +723,7 @@
           <w:sz w:val="21"/>
           <w:szCs w:val="21"/>
         </w:rPr>
-        <w:t xml:space="preserve">BrightSmile Dental Clinic — GHL Automation System</w:t>
+        <w:t xml:space="preserve">Business Group Automation Hub — 5-Module Portfolio Project</w:t>
       </w:r>
     </w:p>
     <w:p>
@@ -746,75 +748,104 @@
           <w:sz w:val="19"/>
           <w:szCs w:val="19"/>
         </w:rPr>
-        <w:t xml:space="preserve">GoHighLevel (GHL), CSS/landing page design, CRM pipelines</w:t>
-      </w:r>
-    </w:p>
-    <w:p>
-      <w:pPr>
-        <w:pStyle w:val="ListParagraph"/>
-        <w:numPr>
-          <w:ilvl w:val="0"/>
-          <w:numId w:val="1"/>
-        </w:numPr>
-        <w:spacing w:after="60"/>
-      </w:pPr>
-      <w:r>
-        <w:rPr>
-          <w:sz w:val="20"/>
-          <w:szCs w:val="20"/>
-        </w:rPr>
-        <w:t xml:space="preserve">Designed a custom landing page with hover CSS effects, portrait image layout, and overlay badge design.</w:t>
-      </w:r>
-    </w:p>
-    <w:p>
-      <w:pPr>
-        <w:pStyle w:val="ListParagraph"/>
-        <w:numPr>
-          <w:ilvl w:val="0"/>
-          <w:numId w:val="1"/>
-        </w:numPr>
-        <w:spacing w:after="60"/>
-      </w:pPr>
-      <w:r>
-        <w:rPr>
-          <w:sz w:val="20"/>
-          <w:szCs w:val="20"/>
-        </w:rPr>
-        <w:t xml:space="preserve">Built a full appointment lifecycle workflow: appointment confirmation → tagging → opportunity creation → confirmation email → 24-hour wait → conditional branch (confirmed vs. no response) → automated SMS/email reminder.</w:t>
-      </w:r>
-    </w:p>
-    <w:p>
-      <w:pPr>
-        <w:pStyle w:val="ListParagraph"/>
-        <w:numPr>
-          <w:ilvl w:val="0"/>
-          <w:numId w:val="1"/>
-        </w:numPr>
-        <w:spacing w:after="60"/>
-      </w:pPr>
-      <w:r>
-        <w:rPr>
-          <w:sz w:val="20"/>
-          <w:szCs w:val="20"/>
-        </w:rPr>
-        <w:t xml:space="preserve">Implemented a custom contact field (Confirmation Status) and reply-detection workflow to programmatically confirm appointments from inbound SMS replies.</w:t>
-      </w:r>
-    </w:p>
-    <w:p>
-      <w:pPr>
-        <w:pStyle w:val="ListParagraph"/>
-        <w:numPr>
-          <w:ilvl w:val="0"/>
-          <w:numId w:val="1"/>
-        </w:numPr>
-        <w:spacing w:after="60"/>
-      </w:pPr>
-      <w:r>
-        <w:rPr>
-          <w:sz w:val="20"/>
-          <w:szCs w:val="20"/>
-        </w:rPr>
-        <w:t xml:space="preserve">Structured a patient-journey pipeline (New Lead → Booked → Confirmed → Completed → No-Show → Lost) with opportunities tied to each stage for full visibility into patient status.</w:t>
+        <w:t xml:space="preserve">n8n, Groq AI, Google Sheets, Gmail, Serper.dev</w:t>
+      </w:r>
+    </w:p>
+    <w:p>
+      <w:pPr>
+        <w:spacing w:after="40"/>
+      </w:pPr>
+      <w:r>
+        <w:rPr>
+          <w:sz w:val="20"/>
+          <w:szCs w:val="20"/>
+        </w:rPr>
+        <w:t xml:space="preserve">Built for a multi-industry Australian business group, covering five distinct operational functions in a single automation ecosystem:</w:t>
+      </w:r>
+    </w:p>
+    <w:p>
+      <w:pPr>
+        <w:pStyle w:val="ListParagraph"/>
+        <w:numPr>
+          <w:ilvl w:val="0"/>
+          <w:numId w:val="1"/>
+        </w:numPr>
+        <w:spacing w:after="60"/>
+      </w:pPr>
+      <w:r>
+        <w:rPr>
+          <w:sz w:val="20"/>
+          <w:szCs w:val="20"/>
+        </w:rPr>
+        <w:t xml:space="preserve">Weekly Operations Report — automated data aggregation and summary distribution.</w:t>
+      </w:r>
+    </w:p>
+    <w:p>
+      <w:pPr>
+        <w:pStyle w:val="ListParagraph"/>
+        <w:numPr>
+          <w:ilvl w:val="0"/>
+          <w:numId w:val="1"/>
+        </w:numPr>
+        <w:spacing w:after="60"/>
+      </w:pPr>
+      <w:r>
+        <w:rPr>
+          <w:sz w:val="20"/>
+          <w:szCs w:val="20"/>
+        </w:rPr>
+        <w:t xml:space="preserve">AI Lead Tracker — AI-assisted lead capture, scoring, and CRM logging.</w:t>
+      </w:r>
+    </w:p>
+    <w:p>
+      <w:pPr>
+        <w:pStyle w:val="ListParagraph"/>
+        <w:numPr>
+          <w:ilvl w:val="0"/>
+          <w:numId w:val="1"/>
+        </w:numPr>
+        <w:spacing w:after="60"/>
+      </w:pPr>
+      <w:r>
+        <w:rPr>
+          <w:sz w:val="20"/>
+          <w:szCs w:val="20"/>
+        </w:rPr>
+        <w:t xml:space="preserve">Invoice Follow-up Automation — automated payment reminder sequences.</w:t>
+      </w:r>
+    </w:p>
+    <w:p>
+      <w:pPr>
+        <w:pStyle w:val="ListParagraph"/>
+        <w:numPr>
+          <w:ilvl w:val="0"/>
+          <w:numId w:val="1"/>
+        </w:numPr>
+        <w:spacing w:after="60"/>
+      </w:pPr>
+      <w:r>
+        <w:rPr>
+          <w:sz w:val="20"/>
+          <w:szCs w:val="20"/>
+        </w:rPr>
+        <w:t xml:space="preserve">Property Project Tracker — status tracking across active property projects.</w:t>
+      </w:r>
+    </w:p>
+    <w:p>
+      <w:pPr>
+        <w:pStyle w:val="ListParagraph"/>
+        <w:numPr>
+          <w:ilvl w:val="0"/>
+          <w:numId w:val="1"/>
+        </w:numPr>
+        <w:spacing w:after="60"/>
+      </w:pPr>
+      <w:r>
+        <w:rPr>
+          <w:sz w:val="20"/>
+          <w:szCs w:val="20"/>
+        </w:rPr>
+        <w:t xml:space="preserve">Research Summarizer — AI-generated research digests using Serper.dev search + Groq summarization.</w:t>
       </w:r>
     </w:p>
     <w:p>
@@ -829,7 +860,7 @@
           <w:sz w:val="21"/>
           <w:szCs w:val="21"/>
         </w:rPr>
-        <w:t xml:space="preserve">Lead Follow-up &amp; Recovery System</w:t>
+        <w:t xml:space="preserve">Mini RAG Note Generator</w:t>
       </w:r>
     </w:p>
     <w:p>
@@ -854,24 +885,41 @@
           <w:sz w:val="19"/>
           <w:szCs w:val="19"/>
         </w:rPr>
-        <w:t xml:space="preserve">Google Forms, n8n, Groq, Gmail</w:t>
-      </w:r>
-    </w:p>
-    <w:p>
-      <w:pPr>
-        <w:pStyle w:val="ListParagraph"/>
-        <w:numPr>
-          <w:ilvl w:val="0"/>
-          <w:numId w:val="1"/>
-        </w:numPr>
-        <w:spacing w:after="60"/>
-      </w:pPr>
-      <w:r>
-        <w:rPr>
-          <w:sz w:val="20"/>
-          <w:szCs w:val="20"/>
-        </w:rPr>
-        <w:t xml:space="preserve">Automated lead intake from Google Forms through n8n, with Groq-generated personalized follow-up emails and reply detection to auto-pause sequences once a lead responded.</w:t>
+        <w:t xml:space="preserve">n8n, RAG architecture, GPT workflows, JSON knowledge assets</w:t>
+      </w:r>
+    </w:p>
+    <w:p>
+      <w:pPr>
+        <w:pStyle w:val="ListParagraph"/>
+        <w:numPr>
+          <w:ilvl w:val="0"/>
+          <w:numId w:val="1"/>
+        </w:numPr>
+        <w:spacing w:after="60"/>
+      </w:pPr>
+      <w:r>
+        <w:rPr>
+          <w:sz w:val="20"/>
+          <w:szCs w:val="20"/>
+        </w:rPr>
+        <w:t xml:space="preserve">Built to demonstrate applied AI documentation skills for a healthcare-tech AI Implementation Specialist role.</w:t>
+      </w:r>
+    </w:p>
+    <w:p>
+      <w:pPr>
+        <w:pStyle w:val="ListParagraph"/>
+        <w:numPr>
+          <w:ilvl w:val="0"/>
+          <w:numId w:val="1"/>
+        </w:numPr>
+        <w:spacing w:after="60"/>
+      </w:pPr>
+      <w:r>
+        <w:rPr>
+          <w:sz w:val="20"/>
+          <w:szCs w:val="20"/>
+        </w:rPr>
+        <w:t xml:space="preserve">Mapped clinical documentation needs (SOAP notes, structured records) to a retrieval-augmented generation pipeline, converting unstructured input into structured, retrievable knowledge assets.</w:t>
       </w:r>
     </w:p>
     <w:p>
@@ -886,7 +934,7 @@
           <w:sz w:val="21"/>
           <w:szCs w:val="21"/>
         </w:rPr>
-        <w:t xml:space="preserve">Automated YouTube Channel Pipeline</w:t>
+        <w:t xml:space="preserve">BrightSmile Dental Clinic — GHL Automation System</w:t>
       </w:r>
     </w:p>
     <w:p>
@@ -911,24 +959,75 @@
           <w:sz w:val="19"/>
           <w:szCs w:val="19"/>
         </w:rPr>
-        <w:t xml:space="preserve">YouTube Data API, Groq, D-ID, auto-upload automation</w:t>
-      </w:r>
-    </w:p>
-    <w:p>
-      <w:pPr>
-        <w:pStyle w:val="ListParagraph"/>
-        <w:numPr>
-          <w:ilvl w:val="0"/>
-          <w:numId w:val="1"/>
-        </w:numPr>
-        <w:spacing w:after="60"/>
-      </w:pPr>
-      <w:r>
-        <w:rPr>
-          <w:sz w:val="20"/>
-          <w:szCs w:val="20"/>
-        </w:rPr>
-        <w:t xml:space="preserve">End-to-end content pipeline: topic sourcing, AI script generation, D-ID video synthesis, and automated upload to YouTube.</w:t>
+        <w:t xml:space="preserve">GoHighLevel (GHL), CSS/landing page design, CRM pipelines</w:t>
+      </w:r>
+    </w:p>
+    <w:p>
+      <w:pPr>
+        <w:pStyle w:val="ListParagraph"/>
+        <w:numPr>
+          <w:ilvl w:val="0"/>
+          <w:numId w:val="1"/>
+        </w:numPr>
+        <w:spacing w:after="60"/>
+      </w:pPr>
+      <w:r>
+        <w:rPr>
+          <w:sz w:val="20"/>
+          <w:szCs w:val="20"/>
+        </w:rPr>
+        <w:t xml:space="preserve">Designed a custom landing page with hover CSS effects, portrait image layout, and overlay badge design.</w:t>
+      </w:r>
+    </w:p>
+    <w:p>
+      <w:pPr>
+        <w:pStyle w:val="ListParagraph"/>
+        <w:numPr>
+          <w:ilvl w:val="0"/>
+          <w:numId w:val="1"/>
+        </w:numPr>
+        <w:spacing w:after="60"/>
+      </w:pPr>
+      <w:r>
+        <w:rPr>
+          <w:sz w:val="20"/>
+          <w:szCs w:val="20"/>
+        </w:rPr>
+        <w:t xml:space="preserve">Built a full appointment lifecycle workflow: appointment confirmation → tagging → opportunity creation → confirmation email → 24-hour wait → conditional branch (confirmed vs. no response) → automated SMS/email reminder.</w:t>
+      </w:r>
+    </w:p>
+    <w:p>
+      <w:pPr>
+        <w:pStyle w:val="ListParagraph"/>
+        <w:numPr>
+          <w:ilvl w:val="0"/>
+          <w:numId w:val="1"/>
+        </w:numPr>
+        <w:spacing w:after="60"/>
+      </w:pPr>
+      <w:r>
+        <w:rPr>
+          <w:sz w:val="20"/>
+          <w:szCs w:val="20"/>
+        </w:rPr>
+        <w:t xml:space="preserve">Implemented a custom contact field (Confirmation Status) and reply-detection workflow to programmatically confirm appointments from inbound SMS replies.</w:t>
+      </w:r>
+    </w:p>
+    <w:p>
+      <w:pPr>
+        <w:pStyle w:val="ListParagraph"/>
+        <w:numPr>
+          <w:ilvl w:val="0"/>
+          <w:numId w:val="1"/>
+        </w:numPr>
+        <w:spacing w:after="60"/>
+      </w:pPr>
+      <w:r>
+        <w:rPr>
+          <w:sz w:val="20"/>
+          <w:szCs w:val="20"/>
+        </w:rPr>
+        <w:t xml:space="preserve">Structured a patient-journey pipeline (New Lead → Booked → Confirmed → Completed → No-Show → Lost) with opportunities tied to each stage for full visibility into patient status.</w:t>
       </w:r>
     </w:p>
     <w:p>
@@ -943,7 +1042,7 @@
           <w:sz w:val="21"/>
           <w:szCs w:val="21"/>
         </w:rPr>
-        <w:t xml:space="preserve">FitZone Gym Email Automation</w:t>
+        <w:t xml:space="preserve">Lead Follow-up &amp; Recovery System</w:t>
       </w:r>
     </w:p>
     <w:p>
@@ -968,24 +1067,24 @@
           <w:sz w:val="19"/>
           <w:szCs w:val="19"/>
         </w:rPr>
-        <w:t xml:space="preserve">n8n (first self-built workflow)</w:t>
-      </w:r>
-    </w:p>
-    <w:p>
-      <w:pPr>
-        <w:pStyle w:val="ListParagraph"/>
-        <w:numPr>
-          <w:ilvl w:val="0"/>
-          <w:numId w:val="1"/>
-        </w:numPr>
-        <w:spacing w:after="60"/>
-      </w:pPr>
-      <w:r>
-        <w:rPr>
-          <w:sz w:val="20"/>
-          <w:szCs w:val="20"/>
-        </w:rPr>
-        <w:t xml:space="preserve">Automated membership/lead email sequences for a gym client — foundational project marking the start of the n8n automation portfolio.</w:t>
+        <w:t xml:space="preserve">Google Forms, n8n, Groq, Gmail</w:t>
+      </w:r>
+    </w:p>
+    <w:p>
+      <w:pPr>
+        <w:pStyle w:val="ListParagraph"/>
+        <w:numPr>
+          <w:ilvl w:val="0"/>
+          <w:numId w:val="1"/>
+        </w:numPr>
+        <w:spacing w:after="60"/>
+      </w:pPr>
+      <w:r>
+        <w:rPr>
+          <w:sz w:val="20"/>
+          <w:szCs w:val="20"/>
+        </w:rPr>
+        <w:t xml:space="preserve">Automated lead intake from Google Forms through n8n, with Groq-generated personalized follow-up emails and reply detection to auto-pause sequences once a lead responded.</w:t>
       </w:r>
     </w:p>
     <w:p>
@@ -1016,7 +1115,7 @@
           <w:sz w:val="20"/>
           <w:szCs w:val="20"/>
         </w:rPr>
-        <w:t xml:space="preserve">n8n | Zapier | Make | GoHighLevel (GHL)</w:t>
+        <w:t xml:space="preserve">n8n | Zapier | Make | GoHighLevel (GHL) | AI Prompt Engineering</w:t>
       </w:r>
     </w:p>
     <w:p>

</xml_diff>